<commit_message>
added nextjs aws devops docs
</commit_message>
<xml_diff>
--- a/Deployment Life Cycle.docx
+++ b/Deployment Life Cycle.docx
@@ -821,2054 +821,33 @@
     <w:p>
       <w:pPr>
         <w:rPr>
-          <w:b/>
-          <w:bCs/>
-          <w:sz w:val="28"/>
-          <w:szCs w:val="28"/>
-          <w:lang w:val="en-US"/>
-        </w:rPr>
-      </w:pPr>
-      <w:r>
-        <w:rPr>
-          <w:b/>
-          <w:bCs/>
-          <w:sz w:val="28"/>
-          <w:szCs w:val="28"/>
-          <w:lang w:val="en-US"/>
-        </w:rPr>
-        <w:t xml:space="preserve">How we can integrate </w:t>
-      </w:r>
-      <w:r>
-        <w:rPr>
-          <w:b/>
-          <w:bCs/>
-          <w:sz w:val="28"/>
-          <w:szCs w:val="28"/>
-          <w:lang w:val="en-US"/>
-        </w:rPr>
-        <w:t>our Github to Continous Integration tool with Jenkin and how to Automate the Build.</w:t>
-      </w:r>
-      <w:r>
-        <w:rPr>
-          <w:b/>
-          <w:bCs/>
-          <w:sz w:val="28"/>
-          <w:szCs w:val="28"/>
-          <w:lang w:val="en-US"/>
-        </w:rPr>
-        <w:t xml:space="preserve"> (Comes under </w:t>
-      </w:r>
-      <w:r>
-        <w:rPr>
-          <w:b/>
-          <w:bCs/>
-          <w:i/>
-          <w:iCs/>
-          <w:sz w:val="28"/>
-          <w:szCs w:val="28"/>
-          <w:highlight w:val="yellow"/>
-          <w:lang w:val="en-US"/>
-        </w:rPr>
-        <w:t>CI</w:t>
-      </w:r>
-      <w:r>
-        <w:rPr>
-          <w:b/>
-          <w:bCs/>
-          <w:sz w:val="28"/>
-          <w:szCs w:val="28"/>
-          <w:lang w:val="en-US"/>
-        </w:rPr>
-        <w:t xml:space="preserve"> only)</w:t>
-      </w:r>
-    </w:p>
-    <w:p>
-      <w:pPr>
-        <w:rPr>
-          <w:b/>
-          <w:bCs/>
-          <w:lang w:val="en-US"/>
-        </w:rPr>
-      </w:pPr>
-      <w:r>
-        <w:rPr>
-          <w:b/>
-          <w:bCs/>
-          <w:lang w:val="en-US"/>
-        </w:rPr>
-        <w:t>Step: 1</w:t>
-      </w:r>
-    </w:p>
-    <w:p>
-      <w:pPr>
-        <w:rPr>
-          <w:lang w:val="en-US"/>
-        </w:rPr>
-      </w:pPr>
-      <w:r>
-        <w:rPr>
-          <w:lang w:val="en-US"/>
-        </w:rPr>
-        <w:t>Create a spring boot application with dummy apis and push it your github repository.</w:t>
-      </w:r>
-    </w:p>
-    <w:p>
-      <w:pPr>
-        <w:rPr>
-          <w:i/>
-          <w:iCs/>
-          <w:lang w:val="en-US"/>
-        </w:rPr>
-      </w:pPr>
-      <w:hyperlink r:id="rId5" w:history="1">
-        <w:r>
-          <w:rPr>
-            <w:rStyle w:val="Hyperlink"/>
-            <w:i/>
-            <w:iCs/>
-            <w:lang w:val="en-US"/>
-          </w:rPr>
-          <w:t>https://github.com/vishalkumar392392/end-to-deployment</w:t>
-        </w:r>
-      </w:hyperlink>
-    </w:p>
-    <w:p>
-      <w:pPr>
-        <w:rPr>
-          <w:i/>
-          <w:iCs/>
-          <w:lang w:val="en-US"/>
-        </w:rPr>
-      </w:pPr>
-    </w:p>
-    <w:p>
-      <w:pPr>
-        <w:rPr>
-          <w:lang w:val="en-US"/>
-        </w:rPr>
-      </w:pPr>
-      <w:r>
-        <w:rPr>
-          <w:b/>
-          <w:bCs/>
-          <w:lang w:val="en-US"/>
-        </w:rPr>
-        <w:t>Step: 2</w:t>
-      </w:r>
-      <w:r>
-        <w:rPr>
-          <w:lang w:val="en-US"/>
-        </w:rPr>
-        <w:t xml:space="preserve"> Jenkins server on AWS EC2</w:t>
-      </w:r>
-    </w:p>
-    <w:p>
-      <w:pPr>
-        <w:rPr>
-          <w:lang w:val="en-US"/>
-        </w:rPr>
-      </w:pPr>
-      <w:r>
-        <w:rPr>
-          <w:lang w:val="en-US"/>
-        </w:rPr>
-        <w:lastRenderedPageBreak/>
-        <w:t xml:space="preserve">Open your AWS account and create a EC2 instance using Amazon Linux type. Download the key value pair. Now we have to install the </w:t>
-      </w:r>
-      <w:r>
-        <w:rPr>
-          <w:lang w:val="en-US"/>
-        </w:rPr>
-        <w:t>Jenkins on the EC2 instance. Follow the below URL to install the jenkins in your EC2.</w:t>
-      </w:r>
-    </w:p>
-    <w:p>
-      <w:pPr>
-        <w:rPr>
-          <w:i/>
-          <w:iCs/>
-          <w:lang w:val="en-US"/>
-        </w:rPr>
-      </w:pPr>
-      <w:hyperlink r:id="rId6" w:history="1">
-        <w:r>
-          <w:rPr>
-            <w:rStyle w:val="Hyperlink"/>
-            <w:i/>
-            <w:iCs/>
-            <w:lang w:val="en-US"/>
-          </w:rPr>
-          <w:t>https://www.jenkins.io/doc/tutorials/tutorial-for-installing-jenkins-on-AWS/</w:t>
-        </w:r>
-      </w:hyperlink>
-    </w:p>
-    <w:p>
-      <w:pPr>
-        <w:rPr>
-          <w:i/>
-          <w:iCs/>
-          <w:lang w:val="en-US"/>
-        </w:rPr>
-      </w:pPr>
-    </w:p>
-    <w:p>
-      <w:pPr>
-        <w:rPr>
-          <w:lang w:val="en-US"/>
-        </w:rPr>
-      </w:pPr>
-      <w:r>
-        <w:rPr>
-          <w:b/>
-          <w:bCs/>
-          <w:lang w:val="en-US"/>
-        </w:rPr>
-        <w:t>Step: 3</w:t>
-      </w:r>
-      <w:r>
-        <w:rPr>
-          <w:lang w:val="en-US"/>
-        </w:rPr>
-        <w:t xml:space="preserve"> </w:t>
-      </w:r>
-      <w:r>
-        <w:rPr>
-          <w:lang w:val="en-US"/>
-        </w:rPr>
-        <w:t>Jenkins Server boot up</w:t>
-      </w:r>
-    </w:p>
-    <w:p>
-      <w:pPr>
-        <w:rPr>
-          <w:lang w:val="en-US"/>
-        </w:rPr>
-      </w:pPr>
-      <w:r>
-        <w:rPr>
-          <w:lang w:val="en-US"/>
-        </w:rPr>
-        <w:t xml:space="preserve">Start the Jenkins server and download the default plugins. Create a user with password. </w:t>
-      </w:r>
-    </w:p>
-    <w:p>
-      <w:pPr>
-        <w:rPr>
-          <w:lang w:val="en-US"/>
-        </w:rPr>
-      </w:pPr>
-    </w:p>
-    <w:p>
-      <w:pPr>
-        <w:rPr>
-          <w:lang w:val="en-US"/>
-        </w:rPr>
-      </w:pPr>
-      <w:r>
-        <w:rPr>
-          <w:b/>
-          <w:bCs/>
-          <w:lang w:val="en-US"/>
-        </w:rPr>
-        <w:t>Step: 4</w:t>
-      </w:r>
-      <w:r>
-        <w:rPr>
-          <w:lang w:val="en-US"/>
-        </w:rPr>
-        <w:t xml:space="preserve"> Installing missing dependencies.</w:t>
-      </w:r>
-    </w:p>
-    <w:p>
-      <w:pPr>
-        <w:rPr>
-          <w:lang w:val="en-US"/>
-        </w:rPr>
-      </w:pPr>
-      <w:r>
-        <w:rPr>
-          <w:lang w:val="en-US"/>
-        </w:rPr>
-        <w:t>Install the Git and maven in EC2 instance as root user sudo -i</w:t>
-      </w:r>
-    </w:p>
-    <w:p>
-      <w:pPr>
-        <w:rPr>
-          <w:lang w:val="en-US"/>
-        </w:rPr>
-      </w:pPr>
-    </w:p>
-    <w:p>
-      <w:pPr>
-        <w:rPr>
-          <w:lang w:val="en-US"/>
-        </w:rPr>
-      </w:pPr>
-      <w:r>
-        <w:rPr>
-          <w:b/>
-          <w:bCs/>
-          <w:lang w:val="en-US"/>
-        </w:rPr>
-        <w:t>Step: 5</w:t>
-      </w:r>
-      <w:r>
-        <w:rPr>
-          <w:lang w:val="en-US"/>
-        </w:rPr>
-        <w:t xml:space="preserve"> Process of creating a new </w:t>
-      </w:r>
-    </w:p>
-    <w:p>
-      <w:pPr>
-        <w:pStyle w:val="ListParagraph"/>
-        <w:numPr>
-          <w:ilvl w:val="0"/>
-          <w:numId w:val="2"/>
-        </w:numPr>
-        <w:rPr>
-          <w:i/>
-          <w:iCs/>
-          <w:lang w:val="en-US"/>
-        </w:rPr>
-      </w:pPr>
-      <w:r>
-        <w:rPr>
-          <w:lang w:val="en-US"/>
-        </w:rPr>
-        <w:t>Click on the New Item</w:t>
-      </w:r>
-      <w:r>
-        <w:rPr>
-          <w:lang w:val="en-US"/>
-        </w:rPr>
-        <w:t>.</w:t>
-      </w:r>
-    </w:p>
-    <w:p>
-      <w:pPr>
-        <w:pStyle w:val="ListParagraph"/>
-        <w:numPr>
-          <w:ilvl w:val="0"/>
-          <w:numId w:val="2"/>
-        </w:numPr>
-        <w:rPr>
-          <w:i/>
-          <w:iCs/>
-          <w:lang w:val="en-US"/>
-        </w:rPr>
-      </w:pPr>
-      <w:r>
-        <w:rPr>
-          <w:lang w:val="en-US"/>
-        </w:rPr>
-        <w:t>Enter a item name, select the FreeStyle Project and click ok.</w:t>
-      </w:r>
-    </w:p>
-    <w:p>
-      <w:pPr>
-        <w:pStyle w:val="ListParagraph"/>
-        <w:numPr>
-          <w:ilvl w:val="0"/>
-          <w:numId w:val="2"/>
-        </w:numPr>
-        <w:rPr>
-          <w:i/>
-          <w:iCs/>
-          <w:lang w:val="en-US"/>
-        </w:rPr>
-      </w:pPr>
-      <w:r>
-        <w:rPr>
-          <w:lang w:val="en-US"/>
-        </w:rPr>
-        <w:t>We will go to the configuration page.</w:t>
-      </w:r>
-    </w:p>
-    <w:p>
-      <w:pPr>
-        <w:pStyle w:val="ListParagraph"/>
-        <w:numPr>
-          <w:ilvl w:val="0"/>
-          <w:numId w:val="2"/>
-        </w:numPr>
-        <w:rPr>
-          <w:i/>
-          <w:iCs/>
-          <w:lang w:val="en-US"/>
-        </w:rPr>
-      </w:pPr>
-      <w:r>
-        <w:rPr>
-          <w:lang w:val="en-US"/>
-        </w:rPr>
-        <w:t>Give the Description and check the Github Project option and give the project url and display name.</w:t>
-      </w:r>
-    </w:p>
-    <w:p>
-      <w:pPr>
-        <w:pStyle w:val="ListParagraph"/>
-        <w:numPr>
-          <w:ilvl w:val="0"/>
-          <w:numId w:val="2"/>
-        </w:numPr>
-        <w:rPr>
-          <w:i/>
-          <w:iCs/>
-          <w:lang w:val="en-US"/>
-        </w:rPr>
-      </w:pPr>
-      <w:r>
-        <w:rPr>
-          <w:lang w:val="en-US"/>
-        </w:rPr>
-        <w:t>In Source code Management section select Git Radio button.</w:t>
-      </w:r>
-    </w:p>
-    <w:p>
-      <w:pPr>
-        <w:pStyle w:val="ListParagraph"/>
-        <w:numPr>
-          <w:ilvl w:val="0"/>
-          <w:numId w:val="2"/>
-        </w:numPr>
-        <w:rPr>
-          <w:i/>
-          <w:iCs/>
-          <w:lang w:val="en-US"/>
-        </w:rPr>
-      </w:pPr>
-      <w:r>
-        <w:rPr>
-          <w:lang w:val="en-US"/>
-        </w:rPr>
-        <w:t>Give Repository url, if you are getting the unable to fetch error msg then it means you don’t have the git installed in your EC2 or you need to set the git path in the manage jenkins/Tools Section.</w:t>
-      </w:r>
-    </w:p>
-    <w:p>
-      <w:pPr>
-        <w:pStyle w:val="ListParagraph"/>
-        <w:numPr>
-          <w:ilvl w:val="0"/>
-          <w:numId w:val="2"/>
-        </w:numPr>
-        <w:rPr>
-          <w:i/>
-          <w:iCs/>
-          <w:lang w:val="en-US"/>
-        </w:rPr>
-      </w:pPr>
-      <w:r>
-        <w:rPr>
-          <w:lang w:val="en-US"/>
-        </w:rPr>
-        <w:t>Next Add jenkins credentials by creating</w:t>
-      </w:r>
-      <w:r>
-        <w:rPr>
-          <w:lang w:val="en-US"/>
-        </w:rPr>
-        <w:t>.</w:t>
-      </w:r>
-    </w:p>
-    <w:p>
-      <w:pPr>
-        <w:pStyle w:val="ListParagraph"/>
-        <w:numPr>
-          <w:ilvl w:val="0"/>
-          <w:numId w:val="2"/>
-        </w:numPr>
-        <w:rPr>
-          <w:i/>
-          <w:iCs/>
-          <w:lang w:val="en-US"/>
-        </w:rPr>
-      </w:pPr>
-      <w:r>
-        <w:rPr>
-          <w:lang w:val="en-US"/>
-        </w:rPr>
-        <w:t>Next in the Branches to build section give branch name as “/main”.</w:t>
-      </w:r>
-    </w:p>
-    <w:p>
-      <w:pPr>
-        <w:pStyle w:val="ListParagraph"/>
-        <w:numPr>
-          <w:ilvl w:val="0"/>
-          <w:numId w:val="2"/>
-        </w:numPr>
-        <w:rPr>
-          <w:i/>
-          <w:iCs/>
-          <w:lang w:val="en-US"/>
-        </w:rPr>
-      </w:pPr>
-      <w:r>
-        <w:rPr>
-          <w:lang w:val="en-US"/>
-        </w:rPr>
-        <w:t>In build Triggers section Select the Poll SCM and give the corn expression as “* * * * *”. It means build after each commit and push to the repo.</w:t>
-      </w:r>
-    </w:p>
-    <w:p>
-      <w:pPr>
-        <w:pStyle w:val="ListParagraph"/>
-        <w:numPr>
-          <w:ilvl w:val="0"/>
-          <w:numId w:val="2"/>
-        </w:numPr>
-        <w:rPr>
-          <w:i/>
-          <w:iCs/>
-          <w:lang w:val="en-US"/>
-        </w:rPr>
-      </w:pPr>
-      <w:r>
-        <w:rPr>
-          <w:lang w:val="en-US"/>
-        </w:rPr>
-        <w:t>In the Build Steps, select the Invoke top-level Maven targets. In Goals write “install”.</w:t>
-      </w:r>
-    </w:p>
-    <w:p>
-      <w:pPr>
-        <w:pStyle w:val="ListParagraph"/>
-        <w:numPr>
-          <w:ilvl w:val="0"/>
-          <w:numId w:val="2"/>
-        </w:numPr>
-        <w:rPr>
-          <w:i/>
-          <w:iCs/>
-          <w:lang w:val="en-US"/>
-        </w:rPr>
-      </w:pPr>
-      <w:r>
-        <w:rPr>
-          <w:lang w:val="en-US"/>
-        </w:rPr>
-        <w:t>Click on Apply and Save.</w:t>
-      </w:r>
-    </w:p>
-    <w:p>
-      <w:pPr>
-        <w:pStyle w:val="ListParagraph"/>
-        <w:numPr>
-          <w:ilvl w:val="0"/>
-          <w:numId w:val="2"/>
-        </w:numPr>
-        <w:rPr>
-          <w:i/>
-          <w:iCs/>
-          <w:lang w:val="en-US"/>
-        </w:rPr>
-      </w:pPr>
-      <w:r>
-        <w:rPr>
-          <w:lang w:val="en-US"/>
-        </w:rPr>
-        <w:t>Then click on build. The build will start.</w:t>
-      </w:r>
-    </w:p>
-    <w:p>
-      <w:pPr>
-        <w:rPr>
-          <w:i/>
-          <w:iCs/>
-          <w:lang w:val="en-US"/>
-        </w:rPr>
-      </w:pPr>
-    </w:p>
-    <w:p>
-      <w:pPr>
-        <w:rPr>
-          <w:i/>
-          <w:iCs/>
-          <w:lang w:val="en-US"/>
-        </w:rPr>
-      </w:pPr>
-    </w:p>
-    <w:p>
-      <w:pPr>
-        <w:rPr>
-          <w:i/>
-          <w:iCs/>
-          <w:lang w:val="en-US"/>
-        </w:rPr>
-      </w:pPr>
-    </w:p>
-    <w:p>
-      <w:pPr>
-        <w:rPr>
-          <w:i/>
-          <w:iCs/>
-          <w:lang w:val="en-US"/>
-        </w:rPr>
-      </w:pPr>
-    </w:p>
-    <w:p>
-      <w:pPr>
-        <w:rPr>
-          <w:i/>
-          <w:iCs/>
-          <w:lang w:val="en-US"/>
-        </w:rPr>
-      </w:pPr>
-    </w:p>
-    <w:p>
-      <w:pPr>
-        <w:rPr>
-          <w:i/>
-          <w:iCs/>
-          <w:lang w:val="en-US"/>
-        </w:rPr>
-      </w:pPr>
-    </w:p>
-    <w:p>
-      <w:pPr>
-        <w:rPr>
-          <w:i/>
-          <w:iCs/>
-          <w:lang w:val="en-US"/>
-        </w:rPr>
-      </w:pPr>
-    </w:p>
-    <w:p>
-      <w:pPr>
-        <w:rPr>
-          <w:i/>
-          <w:iCs/>
-          <w:lang w:val="en-US"/>
-        </w:rPr>
-      </w:pPr>
-    </w:p>
-    <w:p>
-      <w:pPr>
-        <w:rPr>
-          <w:i/>
-          <w:iCs/>
-          <w:lang w:val="en-US"/>
-        </w:rPr>
-      </w:pPr>
-    </w:p>
-    <w:p>
-      <w:pPr>
-        <w:rPr>
-          <w:i/>
-          <w:iCs/>
-          <w:lang w:val="en-US"/>
-        </w:rPr>
-      </w:pPr>
-    </w:p>
-    <w:p>
-      <w:pPr>
-        <w:rPr>
-          <w:i/>
-          <w:iCs/>
-          <w:lang w:val="en-US"/>
-        </w:rPr>
-      </w:pPr>
-    </w:p>
-    <w:p>
-      <w:pPr>
-        <w:rPr>
-          <w:i/>
-          <w:iCs/>
-          <w:lang w:val="en-US"/>
-        </w:rPr>
-      </w:pPr>
-    </w:p>
-    <w:p>
-      <w:pPr>
-        <w:rPr>
-          <w:lang w:val="en-US"/>
-        </w:rPr>
-      </w:pPr>
-      <w:r>
-        <w:rPr>
-          <w:lang w:val="en-US"/>
-        </w:rPr>
-        <w:t>Building and Pushing Docker Image to Docker Hub using Jenkins Pipeline</w:t>
-      </w:r>
-    </w:p>
-    <w:p>
-      <w:pPr>
-        <w:rPr>
-          <w:lang w:val="en-US"/>
-        </w:rPr>
-      </w:pPr>
-    </w:p>
-    <w:p>
-      <w:pPr>
-        <w:rPr>
-          <w:b/>
-          <w:bCs/>
-          <w:lang w:val="en-US"/>
-        </w:rPr>
-      </w:pPr>
-      <w:r>
-        <w:rPr>
-          <w:b/>
-          <w:bCs/>
-          <w:lang w:val="en-US"/>
-        </w:rPr>
-        <w:t>Step: 1</w:t>
-      </w:r>
-    </w:p>
-    <w:p>
-      <w:pPr>
-        <w:rPr>
-          <w:lang w:val="en-US"/>
-        </w:rPr>
-      </w:pPr>
-      <w:r>
-        <w:rPr>
-          <w:lang w:val="en-US"/>
-        </w:rPr>
-        <w:t>Create a spring boot application with dummy apis and push it your github repository.</w:t>
-      </w:r>
-    </w:p>
-    <w:p>
-      <w:pPr>
-        <w:rPr>
-          <w:i/>
-          <w:iCs/>
-          <w:lang w:val="en-US"/>
-        </w:rPr>
-      </w:pPr>
-      <w:hyperlink r:id="rId7" w:history="1">
-        <w:r>
-          <w:rPr>
-            <w:rStyle w:val="Hyperlink"/>
-            <w:i/>
-            <w:iCs/>
-            <w:lang w:val="en-US"/>
-          </w:rPr>
-          <w:t>https://github.com/vishalkumar392392/end-to-deployment</w:t>
-        </w:r>
-      </w:hyperlink>
-    </w:p>
-    <w:p>
-      <w:pPr>
-        <w:rPr>
-          <w:i/>
-          <w:iCs/>
-          <w:lang w:val="en-US"/>
-        </w:rPr>
-      </w:pPr>
-    </w:p>
-    <w:p>
-      <w:pPr>
-        <w:rPr>
-          <w:lang w:val="en-US"/>
-        </w:rPr>
-      </w:pPr>
-      <w:r>
-        <w:rPr>
-          <w:b/>
-          <w:bCs/>
-          <w:lang w:val="en-US"/>
-        </w:rPr>
-        <w:t>Step: 2</w:t>
-      </w:r>
-      <w:r>
-        <w:rPr>
-          <w:lang w:val="en-US"/>
-        </w:rPr>
-        <w:t xml:space="preserve"> </w:t>
-      </w:r>
-      <w:hyperlink r:id="rId8" w:history="1">
-        <w:r>
-          <w:rPr>
-            <w:rStyle w:val="Hyperlink"/>
-            <w:lang w:val="en-US"/>
-          </w:rPr>
-          <w:t>Install Java</w:t>
-        </w:r>
-      </w:hyperlink>
-      <w:r>
-        <w:rPr>
-          <w:lang w:val="en-US"/>
-        </w:rPr>
-        <w:t xml:space="preserve">17 and </w:t>
-      </w:r>
-      <w:r>
-        <w:rPr>
-          <w:lang w:val="en-US"/>
-        </w:rPr>
-        <w:t>Jenkins server on AWS EC2</w:t>
-      </w:r>
-    </w:p>
-    <w:p>
-      <w:pPr>
-        <w:rPr>
-          <w:lang w:val="en-US"/>
-        </w:rPr>
-      </w:pPr>
-      <w:r>
-        <w:rPr>
-          <w:lang w:val="en-US"/>
-        </w:rPr>
-        <w:t>Open your AWS account and create a EC2 instance using Amazon Linux type</w:t>
-      </w:r>
-      <w:r>
-        <w:rPr>
-          <w:lang w:val="en-US"/>
-        </w:rPr>
-        <w:t>(t2.large)</w:t>
-      </w:r>
-      <w:r>
-        <w:rPr>
-          <w:lang w:val="en-US"/>
-        </w:rPr>
-        <w:t>. Download the key value pair. Now we have to install the Jenkins on the EC2 instance. Follow the below URL to install the jenkins in your EC2.</w:t>
-      </w:r>
-    </w:p>
-    <w:p>
-      <w:pPr>
-        <w:rPr>
-          <w:i/>
-          <w:iCs/>
-          <w:lang w:val="en-US"/>
-        </w:rPr>
-      </w:pPr>
-      <w:hyperlink r:id="rId9" w:history="1">
-        <w:r>
-          <w:rPr>
-            <w:rStyle w:val="Hyperlink"/>
-            <w:i/>
-            <w:iCs/>
-            <w:lang w:val="en-US"/>
-          </w:rPr>
-          <w:t>https://www.jenkins.io/doc/tutorials/tutorial-for-installing-jenkins-on-AWS/</w:t>
-        </w:r>
-      </w:hyperlink>
-    </w:p>
-    <w:p>
-      <w:pPr>
-        <w:rPr>
-          <w:i/>
-          <w:iCs/>
-          <w:lang w:val="en-US"/>
-        </w:rPr>
-      </w:pPr>
-    </w:p>
-    <w:p>
-      <w:pPr>
-        <w:rPr>
-          <w:lang w:val="en-US"/>
-        </w:rPr>
-      </w:pPr>
-      <w:r>
-        <w:rPr>
-          <w:b/>
-          <w:bCs/>
-          <w:lang w:val="en-US"/>
-        </w:rPr>
-        <w:t>Step: 3</w:t>
-      </w:r>
-      <w:r>
-        <w:rPr>
-          <w:lang w:val="en-US"/>
-        </w:rPr>
-        <w:t xml:space="preserve"> Jenkins Server boot up</w:t>
-      </w:r>
-    </w:p>
-    <w:p>
-      <w:pPr>
-        <w:rPr>
-          <w:lang w:val="en-US"/>
-        </w:rPr>
-      </w:pPr>
-      <w:r>
-        <w:rPr>
-          <w:lang w:val="en-US"/>
-        </w:rPr>
-        <w:t xml:space="preserve">Start the Jenkins server and download the default plugins. Create a user with password. </w:t>
-      </w:r>
-    </w:p>
-    <w:p>
-      <w:pPr>
-        <w:rPr>
-          <w:lang w:val="en-US"/>
-        </w:rPr>
-      </w:pPr>
-    </w:p>
-    <w:p>
-      <w:pPr>
-        <w:rPr>
-          <w:lang w:val="en-US"/>
-        </w:rPr>
-      </w:pPr>
-      <w:r>
-        <w:rPr>
-          <w:b/>
-          <w:bCs/>
-          <w:lang w:val="en-US"/>
-        </w:rPr>
-        <w:t>Step: 4</w:t>
-      </w:r>
-      <w:r>
-        <w:rPr>
-          <w:lang w:val="en-US"/>
-        </w:rPr>
-        <w:t xml:space="preserve"> Installing missing dependencies.</w:t>
-      </w:r>
-    </w:p>
-    <w:p>
-      <w:pPr>
-        <w:rPr>
-          <w:lang w:val="en-US"/>
-        </w:rPr>
-      </w:pPr>
-      <w:r>
-        <w:rPr>
-          <w:lang w:val="en-US"/>
-        </w:rPr>
-        <w:t>Install the Git and maven in EC2 instance as root user sudo -i</w:t>
-      </w:r>
-    </w:p>
-    <w:p>
-      <w:pPr>
-        <w:rPr>
-          <w:lang w:val="en-US"/>
-        </w:rPr>
-      </w:pPr>
-    </w:p>
-    <w:p>
-      <w:pPr>
-        <w:rPr>
-          <w:lang w:val="en-US"/>
-        </w:rPr>
-      </w:pPr>
-      <w:r>
-        <w:rPr>
-          <w:b/>
-          <w:bCs/>
-          <w:lang w:val="en-US"/>
-        </w:rPr>
-        <w:t>Step 5</w:t>
-      </w:r>
-      <w:r>
-        <w:rPr>
-          <w:lang w:val="en-US"/>
-        </w:rPr>
-        <w:t>: Install Docker in EC2 instance. Follow the below url.</w:t>
-      </w:r>
-    </w:p>
-    <w:p>
-      <w:pPr>
-        <w:rPr>
-          <w:lang w:val="en-US"/>
-        </w:rPr>
-      </w:pPr>
-      <w:hyperlink r:id="rId10" w:history="1">
-        <w:r>
-          <w:rPr>
-            <w:rStyle w:val="Hyperlink"/>
-            <w:lang w:val="en-US"/>
-          </w:rPr>
-          <w:t>https://www.cyberciti.biz/faq/how-to-install-docker-on-amazon-linux-2/</w:t>
-        </w:r>
-      </w:hyperlink>
-    </w:p>
-    <w:p>
-      <w:pPr>
-        <w:rPr>
-          <w:lang w:val="en-US"/>
-        </w:rPr>
-      </w:pPr>
-    </w:p>
-    <w:p>
-      <w:pPr>
-        <w:rPr>
-          <w:lang w:val="en-US"/>
-        </w:rPr>
-      </w:pPr>
-      <w:r>
-        <w:rPr>
-          <w:lang w:val="en-US"/>
-        </w:rPr>
-        <w:t>Execute this below commands other wise we cannot connect to docker from jenkins server.</w:t>
-      </w:r>
-    </w:p>
-    <w:p>
-      <w:pPr>
-        <w:rPr>
-          <w:b/>
-          <w:bCs/>
-          <w:i/>
-          <w:iCs/>
-          <w:lang w:val="en-US"/>
-        </w:rPr>
-      </w:pPr>
-      <w:r>
-        <w:rPr>
-          <w:b/>
-          <w:bCs/>
-          <w:i/>
-          <w:iCs/>
-          <w:lang w:val="en-US"/>
-        </w:rPr>
-        <w:t>sudo usermod -aG docker jenkins</w:t>
-      </w:r>
-    </w:p>
-    <w:p>
-      <w:pPr>
-        <w:rPr>
-          <w:i/>
-          <w:iCs/>
-          <w:lang w:val="en-US"/>
-        </w:rPr>
-      </w:pPr>
-      <w:r>
-        <w:rPr>
-          <w:b/>
-          <w:bCs/>
-          <w:i/>
-          <w:iCs/>
-          <w:lang w:val="en-US"/>
-        </w:rPr>
-        <w:t>sudo systemctl restart jenkin</w:t>
-      </w:r>
-      <w:r>
-        <w:rPr>
-          <w:i/>
-          <w:iCs/>
-          <w:lang w:val="en-US"/>
-        </w:rPr>
-        <w:t>s</w:t>
-      </w:r>
-    </w:p>
-    <w:p>
-      <w:pPr>
-        <w:rPr>
-          <w:lang w:val="en-US"/>
-        </w:rPr>
-      </w:pPr>
-    </w:p>
-    <w:p>
-      <w:pPr>
-        <w:rPr>
-          <w:lang w:val="en-US"/>
-        </w:rPr>
-      </w:pPr>
-      <w:r>
-        <w:rPr>
-          <w:b/>
-          <w:bCs/>
-          <w:lang w:val="en-US"/>
-        </w:rPr>
-        <w:t>Step 6</w:t>
-      </w:r>
-      <w:r>
-        <w:rPr>
-          <w:lang w:val="en-US"/>
-        </w:rPr>
-        <w:t xml:space="preserve">: </w:t>
-      </w:r>
-      <w:r>
-        <w:rPr>
-          <w:b/>
-          <w:bCs/>
-          <w:lang w:val="en-US"/>
-        </w:rPr>
-        <w:t>M</w:t>
-      </w:r>
-      <w:r>
-        <w:rPr>
-          <w:b/>
-          <w:bCs/>
-          <w:lang w:val="en-US"/>
-        </w:rPr>
-        <w:t xml:space="preserve">aven </w:t>
-      </w:r>
-      <w:r>
-        <w:rPr>
-          <w:b/>
-          <w:bCs/>
-          <w:lang w:val="en-US"/>
-        </w:rPr>
-        <w:t>C</w:t>
-      </w:r>
-      <w:r>
-        <w:rPr>
-          <w:b/>
-          <w:bCs/>
-          <w:lang w:val="en-US"/>
-        </w:rPr>
-        <w:t>onfig</w:t>
-      </w:r>
-    </w:p>
-    <w:p>
-      <w:pPr>
-        <w:rPr>
-          <w:lang w:val="en-US"/>
-        </w:rPr>
-      </w:pPr>
-      <w:r>
-        <w:rPr>
-          <w:lang w:val="en-US"/>
-        </w:rPr>
-        <w:t xml:space="preserve">1. </w:t>
-      </w:r>
-      <w:r>
-        <w:rPr>
-          <w:lang w:val="en-US"/>
-        </w:rPr>
-        <w:t xml:space="preserve">Click on </w:t>
-      </w:r>
-      <w:r>
-        <w:rPr>
-          <w:lang w:val="en-US"/>
-        </w:rPr>
-        <w:t>Manage Jenkins/Tools, configure the maven.</w:t>
-      </w:r>
-    </w:p>
-    <w:p>
-      <w:pPr>
-        <w:rPr>
-          <w:lang w:val="en-US"/>
-        </w:rPr>
-      </w:pPr>
-      <w:r>
-        <w:rPr>
-          <w:lang w:val="en-US"/>
-        </w:rPr>
-        <w:t>2. Under Maven Installation, give name as 3.8.4, select the version as 3.8.5. Click apply and Save.</w:t>
-      </w:r>
-    </w:p>
-    <w:p>
-      <w:pPr>
-        <w:rPr>
-          <w:lang w:val="en-US"/>
-        </w:rPr>
-      </w:pPr>
-      <w:r>
-        <w:rPr>
-          <w:b/>
-          <w:bCs/>
-          <w:lang w:val="en-US"/>
-        </w:rPr>
-        <w:t xml:space="preserve">Step </w:t>
-      </w:r>
-      <w:r>
-        <w:rPr>
-          <w:b/>
-          <w:bCs/>
-          <w:lang w:val="en-US"/>
-        </w:rPr>
-        <w:t>7</w:t>
-      </w:r>
-      <w:r>
-        <w:rPr>
-          <w:lang w:val="en-US"/>
-        </w:rPr>
-        <w:t>: Create the script for the build trigger and run the pipeline. Refer below link</w:t>
-      </w:r>
-    </w:p>
-    <w:p>
-      <w:pPr>
-        <w:rPr>
-          <w:lang w:val="en-US"/>
-        </w:rPr>
-      </w:pPr>
-      <w:hyperlink r:id="rId11" w:history="1">
-        <w:r>
-          <w:rPr>
-            <w:rStyle w:val="Hyperlink"/>
-            <w:lang w:val="en-US"/>
-          </w:rPr>
-          <w:t>https://youtu.be/PKcGy9oPVXg?si=9NysjeaCM2LrS7eq</w:t>
-        </w:r>
-      </w:hyperlink>
-    </w:p>
-    <w:p>
-      <w:pPr>
-        <w:rPr>
-          <w:lang w:val="en-US"/>
-        </w:rPr>
-      </w:pPr>
-    </w:p>
-    <w:p>
-      <w:pPr>
-        <w:rPr>
-          <w:lang w:val="en-US"/>
-        </w:rPr>
-      </w:pPr>
-    </w:p>
-    <w:p>
-      <w:pPr>
-        <w:rPr>
-          <w:lang w:val="en-US"/>
-        </w:rPr>
-      </w:pPr>
-    </w:p>
-    <w:p>
-      <w:pPr>
-        <w:rPr>
-          <w:lang w:val="en-US"/>
-        </w:rPr>
-      </w:pPr>
-    </w:p>
-    <w:p>
-      <w:pPr>
-        <w:rPr>
-          <w:lang w:val="en-US"/>
-        </w:rPr>
-      </w:pPr>
-    </w:p>
-    <w:p>
-      <w:pPr>
-        <w:rPr>
-          <w:lang w:val="en-US"/>
-        </w:rPr>
-      </w:pPr>
-    </w:p>
-    <w:p>
-      <w:pPr>
-        <w:rPr>
-          <w:lang w:val="en-US"/>
-        </w:rPr>
-      </w:pPr>
-    </w:p>
-    <w:p>
-      <w:pPr>
-        <w:rPr>
-          <w:lang w:val="en-US"/>
-        </w:rPr>
-      </w:pPr>
-    </w:p>
-    <w:p>
-      <w:pPr>
-        <w:rPr>
-          <w:lang w:val="en-US"/>
-        </w:rPr>
-      </w:pPr>
-    </w:p>
-    <w:p>
-      <w:pPr>
-        <w:rPr>
-          <w:lang w:val="en-US"/>
-        </w:rPr>
-      </w:pPr>
-    </w:p>
-    <w:p>
-      <w:pPr>
-        <w:rPr>
-          <w:lang w:val="en-US"/>
-        </w:rPr>
-      </w:pPr>
-    </w:p>
-    <w:p>
-      <w:pPr>
-        <w:rPr>
-          <w:lang w:val="en-US"/>
-        </w:rPr>
-      </w:pPr>
-    </w:p>
-    <w:p>
-      <w:pPr>
-        <w:rPr>
-          <w:lang w:val="en-US"/>
-        </w:rPr>
-      </w:pPr>
-    </w:p>
-    <w:p>
-      <w:pPr>
-        <w:rPr>
-          <w:lang w:val="en-US"/>
-        </w:rPr>
-      </w:pPr>
-    </w:p>
-    <w:p>
-      <w:pPr>
-        <w:rPr>
-          <w:lang w:val="en-US"/>
-        </w:rPr>
-      </w:pPr>
-    </w:p>
-    <w:p>
-      <w:pPr>
-        <w:rPr>
-          <w:lang w:val="en-US"/>
-        </w:rPr>
-      </w:pPr>
-    </w:p>
-    <w:p>
-      <w:pPr>
-        <w:pBdr>
-          <w:bottom w:val="single" w:sz="6" w:space="1" w:color="auto"/>
-        </w:pBdr>
-        <w:rPr>
-          <w:lang w:val="en-US"/>
-        </w:rPr>
-      </w:pPr>
-      <w:r>
-        <w:rPr>
-          <w:lang w:val="en-US"/>
-        </w:rPr>
-        <w:t>Install kubernetes:</w:t>
-      </w:r>
-    </w:p>
-    <w:p>
-      <w:pPr>
-        <w:rPr>
-          <w:lang w:val="en-US"/>
-        </w:rPr>
-      </w:pPr>
-    </w:p>
-    <w:p>
-      <w:pPr>
-        <w:pBdr>
-          <w:bottom w:val="single" w:sz="6" w:space="1" w:color="auto"/>
-        </w:pBdr>
-        <w:rPr>
-          <w:lang w:val="en-US"/>
-        </w:rPr>
-      </w:pPr>
-      <w:r>
-        <w:rPr>
-          <w:lang w:val="en-US"/>
-        </w:rPr>
-        <w:t>sudo vi /etc/yum.repos.d/kubernetes.repo</w:t>
-      </w:r>
-    </w:p>
-    <w:p>
-      <w:pPr>
-        <w:rPr>
-          <w:lang w:val="en-US"/>
-        </w:rPr>
-      </w:pPr>
-    </w:p>
-    <w:p>
-      <w:pPr>
-        <w:rPr>
-          <w:lang w:val="en-US"/>
-        </w:rPr>
-      </w:pPr>
-      <w:r>
-        <w:rPr>
-          <w:lang w:val="en-US"/>
-        </w:rPr>
-        <w:t>[kubernetes]</w:t>
-      </w:r>
-    </w:p>
-    <w:p>
-      <w:pPr>
-        <w:rPr>
-          <w:lang w:val="en-US"/>
-        </w:rPr>
-      </w:pPr>
-      <w:r>
-        <w:rPr>
-          <w:lang w:val="en-US"/>
-        </w:rPr>
-        <w:t>name=Kubernetes</w:t>
-      </w:r>
-    </w:p>
-    <w:p>
-      <w:pPr>
-        <w:rPr>
-          <w:lang w:val="en-US"/>
-        </w:rPr>
-      </w:pPr>
-      <w:r>
-        <w:rPr>
-          <w:lang w:val="en-US"/>
-        </w:rPr>
-        <w:t>baseurl=https://packages.cloud.google.com/yum/repos/kubernetes-el7-x86_64</w:t>
-      </w:r>
-    </w:p>
-    <w:p>
-      <w:pPr>
-        <w:rPr>
-          <w:lang w:val="en-US"/>
-        </w:rPr>
-      </w:pPr>
-      <w:r>
-        <w:rPr>
-          <w:lang w:val="en-US"/>
-        </w:rPr>
-        <w:t>enabled=1</w:t>
-      </w:r>
-    </w:p>
-    <w:p>
-      <w:pPr>
-        <w:rPr>
-          <w:lang w:val="en-US"/>
-        </w:rPr>
-      </w:pPr>
-      <w:r>
-        <w:rPr>
-          <w:lang w:val="en-US"/>
-        </w:rPr>
-        <w:t>gpgcheck=1</w:t>
-      </w:r>
-    </w:p>
-    <w:p>
-      <w:pPr>
-        <w:rPr>
-          <w:lang w:val="en-US"/>
-        </w:rPr>
-      </w:pPr>
-      <w:r>
-        <w:rPr>
-          <w:lang w:val="en-US"/>
-        </w:rPr>
-        <w:t>repo_gpgcheck=1</w:t>
-      </w:r>
-    </w:p>
-    <w:p>
-      <w:pPr>
-        <w:rPr>
-          <w:lang w:val="en-US"/>
-        </w:rPr>
-      </w:pPr>
-      <w:r>
-        <w:rPr>
-          <w:lang w:val="en-US"/>
-        </w:rPr>
-        <w:t>gpgkey=https://packages.cloud.google.com/yum/doc/yum-key.gpg https://packages.cloud.google.com/yum/doc/rpm-package-key.gpg</w:t>
-      </w:r>
-    </w:p>
-    <w:p>
-      <w:pPr>
-        <w:rPr>
-          <w:lang w:val="en-US"/>
-        </w:rPr>
-      </w:pPr>
-      <w:r>
-        <w:rPr>
-          <w:lang w:val="en-US"/>
-        </w:rPr>
-        <w:t>exclude=kubelet kubeadm kubectl</w:t>
-      </w:r>
-    </w:p>
-    <w:p>
-      <w:pPr>
-        <w:pBdr>
-          <w:top w:val="single" w:sz="6" w:space="1" w:color="auto"/>
-          <w:bottom w:val="single" w:sz="6" w:space="1" w:color="auto"/>
-        </w:pBdr>
-        <w:rPr>
-          <w:lang w:val="en-US"/>
-        </w:rPr>
-      </w:pPr>
-      <w:r>
-        <w:rPr>
-          <w:lang w:val="en-US"/>
-        </w:rPr>
-        <w:lastRenderedPageBreak/>
-        <w:t>sudo yum install -y kubelet kubeadm kubectl --disableexcludes=kubernetes</w:t>
-      </w:r>
-    </w:p>
-    <w:p>
-      <w:pPr>
-        <w:rPr>
-          <w:lang w:val="en-US"/>
-        </w:rPr>
-      </w:pPr>
-      <w:r>
-        <w:rPr>
-          <w:lang w:val="en-US"/>
-        </w:rPr>
-        <w:t>sudo systemctl start kubelet</w:t>
-      </w:r>
-    </w:p>
-    <w:p>
-      <w:pPr>
-        <w:rPr>
-          <w:lang w:val="en-US"/>
-        </w:rPr>
-      </w:pPr>
-      <w:r>
-        <w:rPr>
-          <w:lang w:val="en-US"/>
-        </w:rPr>
-        <w:t>sudo systemctl enable kubelet</w:t>
-      </w:r>
-    </w:p>
-    <w:p>
-      <w:pPr>
-        <w:pBdr>
-          <w:top w:val="single" w:sz="6" w:space="1" w:color="auto"/>
-          <w:bottom w:val="single" w:sz="6" w:space="1" w:color="auto"/>
-        </w:pBdr>
-        <w:rPr>
-          <w:lang w:val="en-US"/>
-        </w:rPr>
-      </w:pPr>
-      <w:r>
-        <w:rPr>
-          <w:lang w:val="en-US"/>
-        </w:rPr>
-        <w:t>sudo kubeadm init --pod-network-cidr=192.168.0.0/16</w:t>
-      </w:r>
-    </w:p>
-    <w:p>
-      <w:pPr>
-        <w:tabs>
-          <w:tab w:val="left" w:pos="560"/>
-          <w:tab w:val="left" w:pos="1120"/>
-          <w:tab w:val="left" w:pos="1680"/>
-          <w:tab w:val="left" w:pos="2240"/>
-          <w:tab w:val="left" w:pos="2800"/>
-          <w:tab w:val="left" w:pos="3360"/>
-          <w:tab w:val="left" w:pos="3920"/>
-          <w:tab w:val="left" w:pos="4480"/>
-          <w:tab w:val="left" w:pos="5040"/>
-          <w:tab w:val="left" w:pos="5600"/>
-          <w:tab w:val="left" w:pos="6160"/>
-          <w:tab w:val="left" w:pos="6720"/>
-        </w:tabs>
-        <w:autoSpaceDE w:val="0"/>
-        <w:autoSpaceDN w:val="0"/>
-        <w:adjustRightInd w:val="0"/>
-        <w:rPr>
-          <w:rFonts w:ascii="Menlo" w:hAnsi="Menlo" w:cs="Menlo"/>
-          <w:color w:val="000000"/>
-          <w:sz w:val="22"/>
-          <w:szCs w:val="22"/>
-          <w:lang w:val="en-GB"/>
-        </w:rPr>
-      </w:pPr>
-      <w:r>
-        <w:rPr>
-          <w:rFonts w:ascii="Menlo" w:hAnsi="Menlo" w:cs="Menlo"/>
-          <w:color w:val="000000"/>
-          <w:sz w:val="22"/>
-          <w:szCs w:val="22"/>
-          <w:lang w:val="en-GB"/>
-        </w:rPr>
-        <w:t>To start using your cluster, you need to run the following as a regular user:</w:t>
-      </w:r>
-    </w:p>
-    <w:p>
-      <w:pPr>
-        <w:tabs>
-          <w:tab w:val="left" w:pos="560"/>
-          <w:tab w:val="left" w:pos="1120"/>
-          <w:tab w:val="left" w:pos="1680"/>
-          <w:tab w:val="left" w:pos="2240"/>
-          <w:tab w:val="left" w:pos="2800"/>
-          <w:tab w:val="left" w:pos="3360"/>
-          <w:tab w:val="left" w:pos="3920"/>
-          <w:tab w:val="left" w:pos="4480"/>
-          <w:tab w:val="left" w:pos="5040"/>
-          <w:tab w:val="left" w:pos="5600"/>
-          <w:tab w:val="left" w:pos="6160"/>
-          <w:tab w:val="left" w:pos="6720"/>
-        </w:tabs>
-        <w:autoSpaceDE w:val="0"/>
-        <w:autoSpaceDN w:val="0"/>
-        <w:adjustRightInd w:val="0"/>
-        <w:rPr>
-          <w:rFonts w:ascii="Menlo" w:hAnsi="Menlo" w:cs="Menlo"/>
-          <w:color w:val="000000"/>
-          <w:sz w:val="22"/>
-          <w:szCs w:val="22"/>
-          <w:lang w:val="en-GB"/>
-        </w:rPr>
-      </w:pPr>
-    </w:p>
-    <w:p>
-      <w:pPr>
-        <w:tabs>
-          <w:tab w:val="left" w:pos="560"/>
-          <w:tab w:val="left" w:pos="1120"/>
-          <w:tab w:val="left" w:pos="1680"/>
-          <w:tab w:val="left" w:pos="2240"/>
-          <w:tab w:val="left" w:pos="2800"/>
-          <w:tab w:val="left" w:pos="3360"/>
-          <w:tab w:val="left" w:pos="3920"/>
-          <w:tab w:val="left" w:pos="4480"/>
-          <w:tab w:val="left" w:pos="5040"/>
-          <w:tab w:val="left" w:pos="5600"/>
-          <w:tab w:val="left" w:pos="6160"/>
-          <w:tab w:val="left" w:pos="6720"/>
-        </w:tabs>
-        <w:autoSpaceDE w:val="0"/>
-        <w:autoSpaceDN w:val="0"/>
-        <w:adjustRightInd w:val="0"/>
-        <w:rPr>
-          <w:rFonts w:ascii="Menlo" w:hAnsi="Menlo" w:cs="Menlo"/>
-          <w:color w:val="000000"/>
-          <w:sz w:val="22"/>
-          <w:szCs w:val="22"/>
-          <w:lang w:val="en-GB"/>
-        </w:rPr>
-      </w:pPr>
-      <w:r>
-        <w:rPr>
-          <w:rFonts w:ascii="Menlo" w:hAnsi="Menlo" w:cs="Menlo"/>
-          <w:color w:val="000000"/>
-          <w:sz w:val="22"/>
-          <w:szCs w:val="22"/>
-          <w:lang w:val="en-GB"/>
-        </w:rPr>
-        <w:t xml:space="preserve">  mkdir -p $HOME/.kube</w:t>
-      </w:r>
-    </w:p>
-    <w:p>
-      <w:pPr>
-        <w:tabs>
-          <w:tab w:val="left" w:pos="560"/>
-          <w:tab w:val="left" w:pos="1120"/>
-          <w:tab w:val="left" w:pos="1680"/>
-          <w:tab w:val="left" w:pos="2240"/>
-          <w:tab w:val="left" w:pos="2800"/>
-          <w:tab w:val="left" w:pos="3360"/>
-          <w:tab w:val="left" w:pos="3920"/>
-          <w:tab w:val="left" w:pos="4480"/>
-          <w:tab w:val="left" w:pos="5040"/>
-          <w:tab w:val="left" w:pos="5600"/>
-          <w:tab w:val="left" w:pos="6160"/>
-          <w:tab w:val="left" w:pos="6720"/>
-        </w:tabs>
-        <w:autoSpaceDE w:val="0"/>
-        <w:autoSpaceDN w:val="0"/>
-        <w:adjustRightInd w:val="0"/>
-        <w:rPr>
-          <w:rFonts w:ascii="Menlo" w:hAnsi="Menlo" w:cs="Menlo"/>
-          <w:color w:val="000000"/>
-          <w:sz w:val="22"/>
-          <w:szCs w:val="22"/>
-          <w:lang w:val="en-GB"/>
-        </w:rPr>
-      </w:pPr>
-      <w:r>
-        <w:rPr>
-          <w:rFonts w:ascii="Menlo" w:hAnsi="Menlo" w:cs="Menlo"/>
-          <w:color w:val="000000"/>
-          <w:sz w:val="22"/>
-          <w:szCs w:val="22"/>
-          <w:lang w:val="en-GB"/>
-        </w:rPr>
-        <w:t xml:space="preserve">  sudo cp -i /etc/kubernetes/admin.conf $HOME/.kube/config</w:t>
-      </w:r>
-    </w:p>
-    <w:p>
-      <w:pPr>
-        <w:tabs>
-          <w:tab w:val="left" w:pos="560"/>
-          <w:tab w:val="left" w:pos="1120"/>
-          <w:tab w:val="left" w:pos="1680"/>
-          <w:tab w:val="left" w:pos="2240"/>
-          <w:tab w:val="left" w:pos="2800"/>
-          <w:tab w:val="left" w:pos="3360"/>
-          <w:tab w:val="left" w:pos="3920"/>
-          <w:tab w:val="left" w:pos="4480"/>
-          <w:tab w:val="left" w:pos="5040"/>
-          <w:tab w:val="left" w:pos="5600"/>
-          <w:tab w:val="left" w:pos="6160"/>
-          <w:tab w:val="left" w:pos="6720"/>
-        </w:tabs>
-        <w:autoSpaceDE w:val="0"/>
-        <w:autoSpaceDN w:val="0"/>
-        <w:adjustRightInd w:val="0"/>
-        <w:rPr>
-          <w:rFonts w:ascii="Menlo" w:hAnsi="Menlo" w:cs="Menlo"/>
-          <w:color w:val="000000"/>
-          <w:sz w:val="22"/>
-          <w:szCs w:val="22"/>
-          <w:lang w:val="en-GB"/>
-        </w:rPr>
-      </w:pPr>
-      <w:r>
-        <w:rPr>
-          <w:rFonts w:ascii="Menlo" w:hAnsi="Menlo" w:cs="Menlo"/>
-          <w:color w:val="000000"/>
-          <w:sz w:val="22"/>
-          <w:szCs w:val="22"/>
-          <w:lang w:val="en-GB"/>
-        </w:rPr>
-        <w:t xml:space="preserve">  sudo chown $(id -u):$(id -g) $HOME/.kube/config</w:t>
-      </w:r>
-    </w:p>
-    <w:p>
-      <w:pPr>
-        <w:tabs>
-          <w:tab w:val="left" w:pos="560"/>
-          <w:tab w:val="left" w:pos="1120"/>
-          <w:tab w:val="left" w:pos="1680"/>
-          <w:tab w:val="left" w:pos="2240"/>
-          <w:tab w:val="left" w:pos="2800"/>
-          <w:tab w:val="left" w:pos="3360"/>
-          <w:tab w:val="left" w:pos="3920"/>
-          <w:tab w:val="left" w:pos="4480"/>
-          <w:tab w:val="left" w:pos="5040"/>
-          <w:tab w:val="left" w:pos="5600"/>
-          <w:tab w:val="left" w:pos="6160"/>
-          <w:tab w:val="left" w:pos="6720"/>
-        </w:tabs>
-        <w:autoSpaceDE w:val="0"/>
-        <w:autoSpaceDN w:val="0"/>
-        <w:adjustRightInd w:val="0"/>
-        <w:rPr>
-          <w:rFonts w:ascii="Menlo" w:hAnsi="Menlo" w:cs="Menlo"/>
-          <w:color w:val="000000"/>
-          <w:sz w:val="22"/>
-          <w:szCs w:val="22"/>
-          <w:lang w:val="en-GB"/>
-        </w:rPr>
-      </w:pPr>
-    </w:p>
-    <w:p>
-      <w:pPr>
-        <w:tabs>
-          <w:tab w:val="left" w:pos="560"/>
-          <w:tab w:val="left" w:pos="1120"/>
-          <w:tab w:val="left" w:pos="1680"/>
-          <w:tab w:val="left" w:pos="2240"/>
-          <w:tab w:val="left" w:pos="2800"/>
-          <w:tab w:val="left" w:pos="3360"/>
-          <w:tab w:val="left" w:pos="3920"/>
-          <w:tab w:val="left" w:pos="4480"/>
-          <w:tab w:val="left" w:pos="5040"/>
-          <w:tab w:val="left" w:pos="5600"/>
-          <w:tab w:val="left" w:pos="6160"/>
-          <w:tab w:val="left" w:pos="6720"/>
-        </w:tabs>
-        <w:autoSpaceDE w:val="0"/>
-        <w:autoSpaceDN w:val="0"/>
-        <w:adjustRightInd w:val="0"/>
-        <w:rPr>
-          <w:rFonts w:ascii="Menlo" w:hAnsi="Menlo" w:cs="Menlo"/>
-          <w:color w:val="000000"/>
-          <w:sz w:val="22"/>
-          <w:szCs w:val="22"/>
-          <w:lang w:val="en-GB"/>
-        </w:rPr>
-      </w:pPr>
-      <w:r>
-        <w:rPr>
-          <w:rFonts w:ascii="Menlo" w:hAnsi="Menlo" w:cs="Menlo"/>
-          <w:color w:val="000000"/>
-          <w:sz w:val="22"/>
-          <w:szCs w:val="22"/>
-          <w:lang w:val="en-GB"/>
-        </w:rPr>
-        <w:t>Alternatively, if you are the root user, you can run:</w:t>
-      </w:r>
-    </w:p>
-    <w:p>
-      <w:pPr>
-        <w:tabs>
-          <w:tab w:val="left" w:pos="560"/>
-          <w:tab w:val="left" w:pos="1120"/>
-          <w:tab w:val="left" w:pos="1680"/>
-          <w:tab w:val="left" w:pos="2240"/>
-          <w:tab w:val="left" w:pos="2800"/>
-          <w:tab w:val="left" w:pos="3360"/>
-          <w:tab w:val="left" w:pos="3920"/>
-          <w:tab w:val="left" w:pos="4480"/>
-          <w:tab w:val="left" w:pos="5040"/>
-          <w:tab w:val="left" w:pos="5600"/>
-          <w:tab w:val="left" w:pos="6160"/>
-          <w:tab w:val="left" w:pos="6720"/>
-        </w:tabs>
-        <w:autoSpaceDE w:val="0"/>
-        <w:autoSpaceDN w:val="0"/>
-        <w:adjustRightInd w:val="0"/>
-        <w:rPr>
-          <w:rFonts w:ascii="Menlo" w:hAnsi="Menlo" w:cs="Menlo"/>
-          <w:color w:val="000000"/>
-          <w:sz w:val="22"/>
-          <w:szCs w:val="22"/>
-          <w:lang w:val="en-GB"/>
-        </w:rPr>
-      </w:pPr>
-    </w:p>
-    <w:p>
-      <w:pPr>
-        <w:rPr>
-          <w:rFonts w:ascii="Menlo" w:hAnsi="Menlo" w:cs="Menlo"/>
-          <w:color w:val="000000"/>
-          <w:sz w:val="22"/>
-          <w:szCs w:val="22"/>
-          <w:lang w:val="en-GB"/>
-        </w:rPr>
-      </w:pPr>
-      <w:r>
-        <w:rPr>
-          <w:rFonts w:ascii="Menlo" w:hAnsi="Menlo" w:cs="Menlo"/>
-          <w:color w:val="000000"/>
-          <w:sz w:val="22"/>
-          <w:szCs w:val="22"/>
-          <w:lang w:val="en-GB"/>
-        </w:rPr>
-        <w:t xml:space="preserve">  export KUBECONFIG=/etc/kubernetes/admin.conf</w:t>
-      </w:r>
-    </w:p>
-    <w:p>
-      <w:pPr>
-        <w:pBdr>
-          <w:top w:val="single" w:sz="6" w:space="1" w:color="auto"/>
-          <w:bottom w:val="single" w:sz="6" w:space="1" w:color="auto"/>
-        </w:pBdr>
-        <w:rPr>
-          <w:lang w:val="en-US"/>
-        </w:rPr>
-      </w:pPr>
-      <w:r>
-        <w:rPr>
-          <w:lang w:val="en-US"/>
-        </w:rPr>
-        <w:t xml:space="preserve">kubectl apply -f </w:t>
-      </w:r>
-      <w:hyperlink r:id="rId12" w:history="1">
-        <w:r>
-          <w:rPr>
-            <w:rStyle w:val="Hyperlink"/>
-            <w:lang w:val="en-US"/>
-          </w:rPr>
-          <w:t>https://docs.projectcalico.org/manifests/calico.yaml</w:t>
-        </w:r>
-      </w:hyperlink>
-    </w:p>
-    <w:p>
-      <w:pPr>
-        <w:rPr>
-          <w:lang w:val="en-US"/>
-        </w:rPr>
-      </w:pPr>
-    </w:p>
-    <w:p>
-      <w:pPr>
-        <w:rPr>
-          <w:lang w:val="en-US"/>
-        </w:rPr>
-      </w:pPr>
-    </w:p>
-    <w:p>
-      <w:pPr>
-        <w:rPr>
-          <w:lang w:val="en-US"/>
-        </w:rPr>
-      </w:pPr>
-    </w:p>
-    <w:p>
-      <w:pPr>
-        <w:rPr>
-          <w:lang w:val="en-US"/>
-        </w:rPr>
-      </w:pPr>
-    </w:p>
-    <w:p>
-      <w:pPr>
-        <w:rPr>
-          <w:lang w:val="en-US"/>
-        </w:rPr>
-      </w:pPr>
-    </w:p>
-    <w:p>
-      <w:pPr>
-        <w:rPr>
-          <w:lang w:val="en-US"/>
-        </w:rPr>
-      </w:pPr>
-    </w:p>
-    <w:p>
-      <w:pPr>
-        <w:rPr>
-          <w:lang w:val="en-US"/>
-        </w:rPr>
-      </w:pPr>
-    </w:p>
-    <w:p>
-      <w:pPr>
-        <w:rPr>
-          <w:lang w:val="en-US"/>
-        </w:rPr>
-      </w:pPr>
-    </w:p>
-    <w:p>
-      <w:pPr>
-        <w:rPr>
-          <w:lang w:val="en-US"/>
-        </w:rPr>
-      </w:pPr>
-    </w:p>
-    <w:p>
-      <w:pPr>
-        <w:rPr>
-          <w:lang w:val="en-US"/>
-        </w:rPr>
-      </w:pPr>
-    </w:p>
-    <w:p>
-      <w:pPr>
-        <w:rPr>
-          <w:lang w:val="en-US"/>
-        </w:rPr>
-      </w:pPr>
-    </w:p>
-    <w:p>
-      <w:pPr>
-        <w:rPr>
-          <w:lang w:val="en-US"/>
-        </w:rPr>
-      </w:pPr>
-    </w:p>
-    <w:p>
-      <w:pPr>
-        <w:rPr>
-          <w:lang w:val="en-US"/>
-        </w:rPr>
-      </w:pPr>
-    </w:p>
-    <w:p>
-      <w:pPr>
-        <w:rPr>
-          <w:lang w:val="en-US"/>
-        </w:rPr>
-      </w:pPr>
-    </w:p>
-    <w:p>
-      <w:pPr>
-        <w:rPr>
-          <w:lang w:val="en-US"/>
-        </w:rPr>
-      </w:pPr>
-    </w:p>
-    <w:p>
-      <w:pPr>
-        <w:rPr>
-          <w:lang w:val="en-US"/>
-        </w:rPr>
-      </w:pPr>
-    </w:p>
-    <w:p>
-      <w:pPr>
-        <w:rPr>
-          <w:lang w:val="en-US"/>
-        </w:rPr>
-      </w:pPr>
-    </w:p>
-    <w:p>
-      <w:pPr>
-        <w:rPr>
-          <w:lang w:val="en-US"/>
-        </w:rPr>
-      </w:pPr>
-    </w:p>
-    <w:p>
-      <w:pPr>
-        <w:rPr>
-          <w:lang w:val="en-US"/>
-        </w:rPr>
-      </w:pPr>
-    </w:p>
-    <w:p>
-      <w:pPr>
-        <w:ind w:left="1440" w:firstLine="720"/>
-        <w:rPr>
-          <w:lang w:val="en-US"/>
-        </w:rPr>
-      </w:pPr>
-    </w:p>
-    <w:p>
-      <w:pPr>
-        <w:ind w:left="1440" w:firstLine="720"/>
-        <w:rPr>
-          <w:lang w:val="en-US"/>
-        </w:rPr>
-      </w:pPr>
-    </w:p>
-    <w:p>
-      <w:pPr>
-        <w:ind w:left="1440" w:firstLine="720"/>
-        <w:rPr>
-          <w:lang w:val="en-US"/>
-        </w:rPr>
-      </w:pPr>
-    </w:p>
-    <w:p>
-      <w:pPr>
-        <w:ind w:left="1440" w:firstLine="720"/>
-        <w:rPr>
-          <w:lang w:val="en-US"/>
-        </w:rPr>
-      </w:pPr>
-    </w:p>
-    <w:p>
-      <w:pPr>
-        <w:ind w:left="1440" w:firstLine="720"/>
-        <w:rPr>
-          <w:lang w:val="en-US"/>
-        </w:rPr>
-      </w:pPr>
-    </w:p>
-    <w:p>
-      <w:pPr>
-        <w:ind w:left="1440" w:firstLine="720"/>
-        <w:rPr>
-          <w:lang w:val="en-US"/>
-        </w:rPr>
-      </w:pPr>
-    </w:p>
-    <w:p>
-      <w:pPr>
-        <w:ind w:left="1440" w:firstLine="720"/>
-        <w:rPr>
-          <w:lang w:val="en-US"/>
-        </w:rPr>
-      </w:pPr>
-    </w:p>
-    <w:p>
-      <w:pPr>
-        <w:ind w:left="1440" w:firstLine="720"/>
-        <w:rPr>
-          <w:lang w:val="en-US"/>
-        </w:rPr>
-      </w:pPr>
-    </w:p>
-    <w:p>
-      <w:pPr>
-        <w:ind w:left="1440" w:firstLine="720"/>
-        <w:rPr>
-          <w:lang w:val="en-US"/>
-        </w:rPr>
-      </w:pPr>
-    </w:p>
-    <w:p>
-      <w:pPr>
-        <w:ind w:left="1440" w:firstLine="720"/>
-        <w:rPr>
-          <w:lang w:val="en-US"/>
-        </w:rPr>
-      </w:pPr>
-    </w:p>
-    <w:p>
-      <w:pPr>
-        <w:ind w:left="1440" w:firstLine="720"/>
-        <w:rPr>
-          <w:lang w:val="en-US"/>
-        </w:rPr>
-      </w:pPr>
-    </w:p>
-    <w:p>
-      <w:pPr>
-        <w:ind w:left="1440" w:firstLine="720"/>
-        <w:rPr>
-          <w:lang w:val="en-US"/>
-        </w:rPr>
-      </w:pPr>
-    </w:p>
-    <w:p>
-      <w:pPr>
-        <w:ind w:left="1440" w:firstLine="720"/>
-        <w:rPr>
-          <w:lang w:val="en-US"/>
-        </w:rPr>
-      </w:pPr>
-    </w:p>
-    <w:p>
-      <w:pPr>
-        <w:ind w:left="1440" w:firstLine="720"/>
+          <w:lang w:val="en-US"/>
+        </w:rPr>
+      </w:pPr>
+    </w:p>
+    <w:p>
+      <w:pPr>
+        <w:rPr>
+          <w:lang w:val="en-US"/>
+        </w:rPr>
+      </w:pPr>
+    </w:p>
+    <w:p>
+      <w:pPr>
+        <w:rPr>
+          <w:lang w:val="en-US"/>
+        </w:rPr>
+      </w:pPr>
+    </w:p>
+    <w:p>
+      <w:pPr>
+        <w:rPr>
+          <w:lang w:val="en-US"/>
+        </w:rPr>
+      </w:pPr>
+    </w:p>
+    <w:p>
+      <w:pPr>
         <w:rPr>
           <w:lang w:val="en-US"/>
         </w:rPr>
@@ -2939,7 +918,7 @@
                     <pic:cNvPicPr/>
                   </pic:nvPicPr>
                   <pic:blipFill>
-                    <a:blip r:embed="rId13" cstate="print">
+                    <a:blip r:embed="rId5" cstate="print">
                       <a:extLst>
                         <a:ext uri="{28A0092B-C50C-407E-A947-70E740481C1C}">
                           <a14:useLocalDpi xmlns:a14="http://schemas.microsoft.com/office/drawing/2010/main" val="0"/>
@@ -3053,7 +1032,7 @@
         </w:rPr>
         <w:t xml:space="preserve"> the my </w:t>
       </w:r>
-      <w:hyperlink r:id="rId14" w:history="1">
+      <w:hyperlink r:id="rId6" w:history="1">
         <w:r>
           <w:rPr>
             <w:rStyle w:val="Hyperlink"/>
@@ -3104,42 +1083,103 @@
         </w:rPr>
         <w:t xml:space="preserve">Install </w:t>
       </w:r>
-      <w:hyperlink r:id="rId15" w:history="1">
+      <w:hyperlink r:id="rId7" w:history="1">
         <w:r>
           <w:rPr>
             <w:rStyle w:val="Hyperlink"/>
             <w:lang w:val="en-US"/>
           </w:rPr>
-          <w:t>java 1</w:t>
+          <w:t>java 17</w:t>
         </w:r>
+      </w:hyperlink>
+      <w:r>
+        <w:rPr>
+          <w:lang w:val="en-US"/>
+        </w:rPr>
+        <w:t xml:space="preserve"> </w:t>
+      </w:r>
+      <w:r>
+        <w:rPr>
+          <w:lang w:val="en-US"/>
+        </w:rPr>
+        <w:t xml:space="preserve">or </w:t>
+      </w:r>
+      <w:hyperlink r:id="rId8" w:history="1">
         <w:r>
           <w:rPr>
             <w:rStyle w:val="Hyperlink"/>
             <w:lang w:val="en-US"/>
           </w:rPr>
-          <w:t>7</w:t>
+          <w:t>java18</w:t>
         </w:r>
       </w:hyperlink>
       <w:r>
         <w:rPr>
           <w:lang w:val="en-US"/>
         </w:rPr>
-        <w:t xml:space="preserve"> and </w:t>
-      </w:r>
-      <w:hyperlink r:id="rId16" w:history="1">
+        <w:t xml:space="preserve"> </w:t>
+      </w:r>
+      <w:r>
+        <w:rPr>
+          <w:lang w:val="en-US"/>
+        </w:rPr>
+        <w:t xml:space="preserve">and </w:t>
+      </w:r>
+      <w:hyperlink r:id="rId9" w:history="1">
         <w:r>
           <w:rPr>
             <w:rStyle w:val="Hyperlink"/>
             <w:lang w:val="en-US"/>
           </w:rPr>
-          <w:t>jen</w:t>
+          <w:t>jenkins</w:t>
         </w:r>
+      </w:hyperlink>
+      <w:r>
+        <w:rPr>
+          <w:lang w:val="en-US"/>
+        </w:rPr>
+        <w:t>.</w:t>
+      </w:r>
+    </w:p>
+    <w:p>
+      <w:pPr>
+        <w:pStyle w:val="ListParagraph"/>
+        <w:numPr>
+          <w:ilvl w:val="0"/>
+          <w:numId w:val="4"/>
+        </w:numPr>
+        <w:rPr>
+          <w:lang w:val="en-US"/>
+        </w:rPr>
+      </w:pPr>
+      <w:r>
+        <w:rPr>
+          <w:lang w:val="en-US"/>
+        </w:rPr>
+        <w:t xml:space="preserve">Install </w:t>
+      </w:r>
+      <w:hyperlink r:id="rId10" w:anchor="readme" w:history="1">
         <w:r>
           <w:rPr>
             <w:rStyle w:val="Hyperlink"/>
             <w:lang w:val="en-US"/>
           </w:rPr>
-          <w:t>k</w:t>
+          <w:t>maven</w:t>
+        </w:r>
+      </w:hyperlink>
+      <w:r>
+        <w:rPr>
+          <w:lang w:val="en-US"/>
+        </w:rPr>
+        <w:t xml:space="preserve"> and </w:t>
+      </w:r>
+      <w:hyperlink r:id="rId11" w:history="1">
+        <w:r>
+          <w:rPr>
+            <w:rStyle w:val="Hyperlink"/>
+            <w:lang w:val="en-US"/>
+          </w:rPr>
+          <w:t>g</w:t>
         </w:r>
         <w:r>
           <w:rPr>
@@ -3153,14 +1193,14 @@
             <w:rStyle w:val="Hyperlink"/>
             <w:lang w:val="en-US"/>
           </w:rPr>
-          <w:t>ns</w:t>
+          <w:t>t</w:t>
         </w:r>
       </w:hyperlink>
       <w:r>
         <w:rPr>
           <w:lang w:val="en-US"/>
         </w:rPr>
-        <w:t>.</w:t>
+        <w:t xml:space="preserve"> in ec2 instance.</w:t>
       </w:r>
     </w:p>
     <w:p>
@@ -3178,7 +1218,19 @@
         <w:rPr>
           <w:lang w:val="en-US"/>
         </w:rPr>
-        <w:t>Install maven and git in ec2 instance.</w:t>
+        <w:t xml:space="preserve">Install </w:t>
+      </w:r>
+      <w:r>
+        <w:rPr>
+          <w:lang w:val="en-US"/>
+        </w:rPr>
+        <w:t xml:space="preserve">Maven Integration Plugin, </w:t>
+      </w:r>
+      <w:r>
+        <w:rPr>
+          <w:lang w:val="en-US"/>
+        </w:rPr>
+        <w:t>Github Plugin and Publish Over SSH plugin.</w:t>
       </w:r>
     </w:p>
     <w:p>
@@ -3196,19 +1248,7 @@
         <w:rPr>
           <w:lang w:val="en-US"/>
         </w:rPr>
-        <w:t xml:space="preserve">Install </w:t>
-      </w:r>
-      <w:r>
-        <w:rPr>
-          <w:lang w:val="en-US"/>
-        </w:rPr>
-        <w:t xml:space="preserve">Maven Integration Plugin, </w:t>
-      </w:r>
-      <w:r>
-        <w:rPr>
-          <w:lang w:val="en-US"/>
-        </w:rPr>
-        <w:t>Github Plugin and Publish Over SSH plugin.</w:t>
+        <w:t>Click on Manage Jenkins/Tools, configure the maven.</w:t>
       </w:r>
     </w:p>
     <w:p>
@@ -3226,7 +1266,31 @@
         <w:rPr>
           <w:lang w:val="en-US"/>
         </w:rPr>
-        <w:t>Click on Manage Jenkins/Tools, configure the maven.</w:t>
+        <w:t>Under Maven Installation, give name as 3.8.4</w:t>
+      </w:r>
+      <w:r>
+        <w:rPr>
+          <w:lang w:val="en-US"/>
+        </w:rPr>
+        <w:t>(maven installed version)</w:t>
+      </w:r>
+      <w:r>
+        <w:rPr>
+          <w:lang w:val="en-US"/>
+        </w:rPr>
+        <w:t>, select the version as 3.8.</w:t>
+      </w:r>
+      <w:r>
+        <w:rPr>
+          <w:lang w:val="en-US"/>
+        </w:rPr>
+        <w:t>4</w:t>
+      </w:r>
+      <w:r>
+        <w:rPr>
+          <w:lang w:val="en-US"/>
+        </w:rPr>
+        <w:t>. Click apply and Save.</w:t>
       </w:r>
     </w:p>
     <w:p>
@@ -3244,51 +1308,9 @@
         <w:rPr>
           <w:lang w:val="en-US"/>
         </w:rPr>
-        <w:t>Under Maven Installation, give name as 3.8.4</w:t>
-      </w:r>
-      <w:r>
-        <w:rPr>
-          <w:lang w:val="en-US"/>
-        </w:rPr>
-        <w:t>(maven installed version)</w:t>
-      </w:r>
-      <w:r>
-        <w:rPr>
-          <w:lang w:val="en-US"/>
-        </w:rPr>
-        <w:t>, select the version as 3.8.</w:t>
-      </w:r>
-      <w:r>
-        <w:rPr>
-          <w:lang w:val="en-US"/>
-        </w:rPr>
-        <w:t>4</w:t>
-      </w:r>
-      <w:r>
-        <w:rPr>
-          <w:lang w:val="en-US"/>
-        </w:rPr>
-        <w:t>. Click apply and Save.</w:t>
-      </w:r>
-    </w:p>
-    <w:p>
-      <w:pPr>
-        <w:pStyle w:val="ListParagraph"/>
-        <w:numPr>
-          <w:ilvl w:val="0"/>
-          <w:numId w:val="4"/>
-        </w:numPr>
-        <w:rPr>
-          <w:lang w:val="en-US"/>
-        </w:rPr>
-      </w:pPr>
-      <w:r>
-        <w:rPr>
-          <w:lang w:val="en-US"/>
-        </w:rPr>
         <w:t xml:space="preserve">Create a new EC2 Amazon linux AMI and </w:t>
       </w:r>
-      <w:hyperlink r:id="rId17" w:history="1">
+      <w:hyperlink r:id="rId12" w:history="1">
         <w:r>
           <w:rPr>
             <w:rStyle w:val="Hyperlink"/>
@@ -3767,7 +1789,7 @@
                     <pic:cNvPicPr/>
                   </pic:nvPicPr>
                   <pic:blipFill>
-                    <a:blip r:embed="rId18" cstate="print">
+                    <a:blip r:embed="rId13" cstate="print">
                       <a:extLst>
                         <a:ext uri="{28A0092B-C50C-407E-A947-70E740481C1C}">
                           <a14:useLocalDpi xmlns:a14="http://schemas.microsoft.com/office/drawing/2010/main" val="0"/>
@@ -4275,7 +2297,7 @@
                     <pic:cNvPicPr/>
                   </pic:nvPicPr>
                   <pic:blipFill>
-                    <a:blip r:embed="rId19" cstate="print">
+                    <a:blip r:embed="rId14" cstate="print">
                       <a:extLst>
                         <a:ext uri="{28A0092B-C50C-407E-A947-70E740481C1C}">
                           <a14:useLocalDpi xmlns:a14="http://schemas.microsoft.com/office/drawing/2010/main" val="0"/>
@@ -4323,7 +2345,7 @@
                     <pic:cNvPicPr/>
                   </pic:nvPicPr>
                   <pic:blipFill>
-                    <a:blip r:embed="rId20" cstate="print">
+                    <a:blip r:embed="rId15" cstate="print">
                       <a:extLst>
                         <a:ext uri="{28A0092B-C50C-407E-A947-70E740481C1C}">
                           <a14:useLocalDpi xmlns:a14="http://schemas.microsoft.com/office/drawing/2010/main" val="0"/>
@@ -4371,7 +2393,7 @@
                     <pic:cNvPicPr/>
                   </pic:nvPicPr>
                   <pic:blipFill>
-                    <a:blip r:embed="rId21" cstate="print">
+                    <a:blip r:embed="rId16" cstate="print">
                       <a:extLst>
                         <a:ext uri="{28A0092B-C50C-407E-A947-70E740481C1C}">
                           <a14:useLocalDpi xmlns:a14="http://schemas.microsoft.com/office/drawing/2010/main" val="0"/>
@@ -4419,7 +2441,7 @@
                     <pic:cNvPicPr/>
                   </pic:nvPicPr>
                   <pic:blipFill>
-                    <a:blip r:embed="rId22" cstate="print">
+                    <a:blip r:embed="rId17" cstate="print">
                       <a:extLst>
                         <a:ext uri="{28A0092B-C50C-407E-A947-70E740481C1C}">
                           <a14:useLocalDpi xmlns:a14="http://schemas.microsoft.com/office/drawing/2010/main" val="0"/>
@@ -4467,7 +2489,7 @@
                     <pic:cNvPicPr/>
                   </pic:nvPicPr>
                   <pic:blipFill>
-                    <a:blip r:embed="rId23" cstate="print">
+                    <a:blip r:embed="rId18" cstate="print">
                       <a:extLst>
                         <a:ext uri="{28A0092B-C50C-407E-A947-70E740481C1C}">
                           <a14:useLocalDpi xmlns:a14="http://schemas.microsoft.com/office/drawing/2010/main" val="0"/>
@@ -5079,43 +3101,7 @@
           <w:highlight w:val="yellow"/>
           <w:lang w:val="en-US"/>
         </w:rPr>
-        <w:t>Once we made new commit to github, Jenkins will build code with help of maven and push the artifacts/jar to ansible, ansible will create a docker image from artifacts and will push it to dockerhub</w:t>
-      </w:r>
-      <w:r>
-        <w:rPr>
-          <w:i/>
-          <w:iCs/>
-          <w:highlight w:val="yellow"/>
-          <w:lang w:val="en-US"/>
-        </w:rPr>
-        <w:t xml:space="preserve"> using playbook1</w:t>
-      </w:r>
-      <w:r>
-        <w:rPr>
-          <w:i/>
-          <w:iCs/>
-          <w:highlight w:val="yellow"/>
-          <w:lang w:val="en-US"/>
-        </w:rPr>
-        <w:t xml:space="preserve"> and once push is done, ansible will trigger dockerhost(ec2 instance) to create a container from newly pushed image and run the conatiner</w:t>
-      </w:r>
-      <w:r>
-        <w:rPr>
-          <w:i/>
-          <w:iCs/>
-          <w:highlight w:val="yellow"/>
-          <w:lang w:val="en-US"/>
-        </w:rPr>
-        <w:t xml:space="preserve"> using another playbook2</w:t>
-      </w:r>
-      <w:r>
-        <w:rPr>
-          <w:i/>
-          <w:iCs/>
-          <w:highlight w:val="yellow"/>
-          <w:lang w:val="en-US"/>
-        </w:rPr>
-        <w:t>.</w:t>
+        <w:t>Once we made new commit to github, Jenkins will build code with help of maven and push the artifacts/jar to ansible, ansible will create a docker image from artifacts and will push it to dockerhub using playbook1 and once push is done, ansible will trigger dockerhost(ec2 instance) to create a container from newly pushed image and run the conatiner using another playbook2.</w:t>
       </w:r>
     </w:p>
     <w:p>
@@ -5152,7 +3138,7 @@
                     <pic:cNvPicPr/>
                   </pic:nvPicPr>
                   <pic:blipFill>
-                    <a:blip r:embed="rId24">
+                    <a:blip r:embed="rId19">
                       <a:extLst>
                         <a:ext uri="{28A0092B-C50C-407E-A947-70E740481C1C}">
                           <a14:useLocalDpi xmlns:a14="http://schemas.microsoft.com/office/drawing/2010/main" val="0"/>
@@ -5609,16 +3595,7 @@
           <w:sz w:val="18"/>
           <w:szCs w:val="18"/>
         </w:rPr>
-        <w:t>i</w:t>
-      </w:r>
-      <w:r>
-        <w:rPr>
-          <w:rFonts w:ascii="Menlo" w:hAnsi="Menlo" w:cs="Menlo"/>
-          <w:color w:val="C586C0"/>
-          <w:sz w:val="18"/>
-          <w:szCs w:val="18"/>
-        </w:rPr>
-        <w:t xml:space="preserve"> /etc/ssh/sshd_config</w:t>
+        <w:t>i /etc/ssh/sshd_config</w:t>
       </w:r>
     </w:p>
     <w:p>
@@ -5693,16 +3670,7 @@
           <w:sz w:val="18"/>
           <w:szCs w:val="18"/>
         </w:rPr>
-        <w:t>s</w:t>
-      </w:r>
-      <w:r>
-        <w:rPr>
-          <w:rFonts w:ascii="Menlo" w:hAnsi="Menlo" w:cs="Menlo"/>
-          <w:color w:val="C586C0"/>
-          <w:sz w:val="18"/>
-          <w:szCs w:val="18"/>
-        </w:rPr>
-        <w:t xml:space="preserve">udo su </w:t>
+        <w:t xml:space="preserve">sudo su </w:t>
       </w:r>
       <w:r>
         <w:rPr>
@@ -5919,7 +3887,7 @@
                     <pic:cNvPicPr/>
                   </pic:nvPicPr>
                   <pic:blipFill>
-                    <a:blip r:embed="rId25">
+                    <a:blip r:embed="rId20">
                       <a:extLst>
                         <a:ext uri="{28A0092B-C50C-407E-A947-70E740481C1C}">
                           <a14:useLocalDpi xmlns:a14="http://schemas.microsoft.com/office/drawing/2010/main" val="0"/>
@@ -6461,25 +4429,7 @@
           <w:sz w:val="18"/>
           <w:szCs w:val="18"/>
         </w:rPr>
-        <w:t>v</w:t>
-      </w:r>
-      <w:r>
-        <w:rPr>
-          <w:rFonts w:ascii="Menlo" w:hAnsi="Menlo" w:cs="Menlo"/>
-          <w:color w:val="C586C0"/>
-          <w:sz w:val="18"/>
-          <w:szCs w:val="18"/>
-        </w:rPr>
-        <w:t>i /etc/ansible/hosts</w:t>
-      </w:r>
-      <w:r>
-        <w:rPr>
-          <w:rFonts w:ascii="Menlo" w:hAnsi="Menlo" w:cs="Menlo"/>
-          <w:color w:val="C586C0"/>
-          <w:sz w:val="18"/>
-          <w:szCs w:val="18"/>
-        </w:rPr>
-        <w:t xml:space="preserve"> </w:t>
+        <w:t xml:space="preserve">vi /etc/ansible/hosts </w:t>
       </w:r>
       <w:r>
         <w:t>add the inet docker ip</w:t>
@@ -6717,7 +4667,7 @@
                     <pic:cNvPicPr/>
                   </pic:nvPicPr>
                   <pic:blipFill>
-                    <a:blip r:embed="rId26">
+                    <a:blip r:embed="rId21">
                       <a:extLst>
                         <a:ext uri="{28A0092B-C50C-407E-A947-70E740481C1C}">
                           <a14:useLocalDpi xmlns:a14="http://schemas.microsoft.com/office/drawing/2010/main" val="0"/>
@@ -6835,7 +4785,7 @@
                     <pic:cNvPicPr/>
                   </pic:nvPicPr>
                   <pic:blipFill>
-                    <a:blip r:embed="rId27" cstate="print">
+                    <a:blip r:embed="rId22" cstate="print">
                       <a:extLst>
                         <a:ext uri="{28A0092B-C50C-407E-A947-70E740481C1C}">
                           <a14:useLocalDpi xmlns:a14="http://schemas.microsoft.com/office/drawing/2010/main" val="0"/>
@@ -6957,10 +4907,7 @@
         </w:tabs>
       </w:pPr>
       <w:r>
-        <w:t xml:space="preserve">vi </w:t>
-      </w:r>
-      <w:r>
-        <w:t>/etc/ansible/hosts</w:t>
+        <w:t>vi /etc/ansible/hosts</w:t>
       </w:r>
     </w:p>
     <w:p>
@@ -8550,7 +6497,7 @@
                     <pic:cNvPicPr/>
                   </pic:nvPicPr>
                   <pic:blipFill>
-                    <a:blip r:embed="rId28" cstate="print">
+                    <a:blip r:embed="rId23" cstate="print">
                       <a:extLst>
                         <a:ext uri="{28A0092B-C50C-407E-A947-70E740481C1C}">
                           <a14:useLocalDpi xmlns:a14="http://schemas.microsoft.com/office/drawing/2010/main" val="0"/>
@@ -8921,7 +6868,7 @@
         </w:rPr>
         <w:t xml:space="preserve"> </w:t>
       </w:r>
-      <w:hyperlink r:id="rId29" w:history="1">
+      <w:hyperlink r:id="rId24" w:history="1">
         <w:r>
           <w:rPr>
             <w:rStyle w:val="Hyperlink"/>
@@ -8980,7 +6927,7 @@
         </w:rPr>
         <w:t xml:space="preserve">Install </w:t>
       </w:r>
-      <w:hyperlink r:id="rId30" w:history="1">
+      <w:hyperlink r:id="rId25" w:history="1">
         <w:r>
           <w:rPr>
             <w:rStyle w:val="Hyperlink"/>
@@ -9007,7 +6954,7 @@
           <w:lang w:val="en-US"/>
         </w:rPr>
       </w:pPr>
-      <w:hyperlink r:id="rId31" w:history="1">
+      <w:hyperlink r:id="rId26" w:history="1">
         <w:r>
           <w:rPr>
             <w:rStyle w:val="Hyperlink"/>
@@ -10441,55 +8388,13 @@
           <w:u w:val="single"/>
           <w:lang w:val="en-US"/>
         </w:rPr>
-        <w:t xml:space="preserve">kubectl apply -f </w:t>
-      </w:r>
-      <w:r>
-        <w:rPr>
-          <w:i/>
-          <w:iCs/>
-          <w:u w:val="single"/>
-          <w:lang w:val="en-US"/>
-        </w:rPr>
-        <w:t>service</w:t>
-      </w:r>
-      <w:r>
-        <w:rPr>
-          <w:i/>
-          <w:iCs/>
-          <w:u w:val="single"/>
-          <w:lang w:val="en-US"/>
-        </w:rPr>
-        <w:t>.yml</w:t>
-      </w:r>
-      <w:r>
-        <w:rPr>
-          <w:lang w:val="en-US"/>
-        </w:rPr>
-        <w:t xml:space="preserve">, a new </w:t>
-      </w:r>
-      <w:r>
-        <w:rPr>
-          <w:lang w:val="en-US"/>
-        </w:rPr>
-        <w:t>service</w:t>
-      </w:r>
-      <w:r>
-        <w:rPr>
-          <w:lang w:val="en-US"/>
-        </w:rPr>
-        <w:t xml:space="preserve"> will create</w:t>
-      </w:r>
-      <w:r>
-        <w:rPr>
-          <w:lang w:val="en-US"/>
-        </w:rPr>
-        <w:t xml:space="preserve"> with loadbalancer</w:t>
-      </w:r>
-      <w:r>
-        <w:rPr>
-          <w:lang w:val="en-US"/>
-        </w:rPr>
-        <w:t>.</w:t>
+        <w:t>kubectl apply -f service.yml</w:t>
+      </w:r>
+      <w:r>
+        <w:rPr>
+          <w:lang w:val="en-US"/>
+        </w:rPr>
+        <w:t>, a new service will create with loadbalancer.</w:t>
       </w:r>
     </w:p>
     <w:p>
@@ -10553,7 +8458,7 @@
                     <pic:cNvPicPr/>
                   </pic:nvPicPr>
                   <pic:blipFill>
-                    <a:blip r:embed="rId32">
+                    <a:blip r:embed="rId27">
                       <a:extLst>
                         <a:ext uri="{28A0092B-C50C-407E-A947-70E740481C1C}">
                           <a14:useLocalDpi xmlns:a14="http://schemas.microsoft.com/office/drawing/2010/main" val="0"/>
@@ -10802,16 +8707,7 @@
           <w:sz w:val="18"/>
           <w:szCs w:val="18"/>
         </w:rPr>
-        <w:t>vi</w:t>
-      </w:r>
-      <w:r>
-        <w:rPr>
-          <w:rFonts w:ascii="Menlo" w:hAnsi="Menlo" w:cs="Menlo"/>
-          <w:color w:val="569CD6"/>
-          <w:sz w:val="18"/>
-          <w:szCs w:val="18"/>
-        </w:rPr>
-        <w:t xml:space="preserve"> /etc/ssh/sshd_config</w:t>
+        <w:t>vi /etc/ssh/sshd_config</w:t>
       </w:r>
     </w:p>
     <w:p>
@@ -11133,25 +9029,7 @@
           <w:sz w:val="18"/>
           <w:szCs w:val="18"/>
         </w:rPr>
-        <w:t xml:space="preserve">ssh-copy-id </w:t>
-      </w:r>
-      <w:r>
-        <w:rPr>
-          <w:rFonts w:ascii="Menlo" w:hAnsi="Menlo" w:cs="Menlo"/>
-          <w:color w:val="569CD6"/>
-          <w:sz w:val="18"/>
-          <w:szCs w:val="18"/>
-        </w:rPr>
-        <w:t>root@</w:t>
-      </w:r>
-      <w:r>
-        <w:rPr>
-          <w:rFonts w:ascii="Menlo" w:hAnsi="Menlo" w:cs="Menlo"/>
-          <w:color w:val="569CD6"/>
-          <w:sz w:val="18"/>
-          <w:szCs w:val="18"/>
-        </w:rPr>
-        <w:t>172.32.45.345</w:t>
+        <w:t>ssh-copy-id root@172.32.45.345</w:t>
       </w:r>
     </w:p>
     <w:p>
@@ -11489,7 +9367,7 @@
                 <wp:cNvGraphicFramePr/>
                 <a:graphic xmlns:a="http://schemas.openxmlformats.org/drawingml/2006/main">
                   <a:graphicData uri="http://schemas.microsoft.com/office/word/2010/wordprocessingInk">
-                    <w14:contentPart bwMode="auto" r:id="rId33">
+                    <w14:contentPart bwMode="auto" r:id="rId28">
                       <w14:nvContentPartPr>
                         <w14:cNvContentPartPr/>
                       </w14:nvContentPartPr>

</xml_diff>